<commit_message>
feat: complete remedial mastery mode, KB v2, and progressive documentation updates
</commit_message>
<xml_diff>
--- a/SmartInterview_Deliverables/02_SRS_Specification/SmartInterview_SRS_Template_Format.docx
+++ b/SmartInterview_Deliverables/02_SRS_Specification/SmartInterview_SRS_Template_Format.docx
@@ -158,124 +158,19 @@
         </w:rPr>
       </w:pPr>
       <w:r>
-        <w:rPr>
-          <w:rFonts w:ascii="Times New Roman" w:hAnsi="Times New Roman"/>
+        <w:t>2. Vasireddy Vignesh Reddy     -        24BD1A665X</w:t>
+      </w:r>
+    </w:p>
+    <w:p>
+      <w:pPr>
+        <w:spacing w:after="60"/>
+        <w:rPr>
           <w:b/>
           <w:bCs/>
-          <w:color w:val="000000"/>
-        </w:rPr>
-        <w:t xml:space="preserve">2. </w:t>
-      </w:r>
-      <w:proofErr w:type="spellStart"/>
-      <w:r>
-        <w:rPr>
-          <w:rFonts w:ascii="Times New Roman" w:hAnsi="Times New Roman"/>
-          <w:b/>
-          <w:bCs/>
-          <w:color w:val="000000"/>
-        </w:rPr>
-        <w:t>Thodsam</w:t>
-      </w:r>
-      <w:proofErr w:type="spellEnd"/>
-      <w:r>
-        <w:rPr>
-          <w:rFonts w:ascii="Times New Roman" w:hAnsi="Times New Roman"/>
-          <w:b/>
-          <w:bCs/>
-          <w:color w:val="000000"/>
-        </w:rPr>
-        <w:t xml:space="preserve"> Srujan </w:t>
-      </w:r>
-      <w:r>
-        <w:rPr>
-          <w:rFonts w:ascii="Times New Roman" w:hAnsi="Times New Roman"/>
-          <w:b/>
-          <w:bCs/>
-          <w:color w:val="000000"/>
-        </w:rPr>
-        <w:tab/>
-        <w:t xml:space="preserve">            </w:t>
-      </w:r>
-      <w:r>
-        <w:rPr>
-          <w:rFonts w:ascii="Times New Roman" w:hAnsi="Times New Roman"/>
-          <w:b/>
-          <w:bCs/>
-          <w:color w:val="000000"/>
-        </w:rPr>
-        <w:t xml:space="preserve">  </w:t>
-      </w:r>
-      <w:r>
-        <w:rPr>
-          <w:rFonts w:ascii="Times New Roman" w:hAnsi="Times New Roman"/>
-          <w:b/>
-          <w:bCs/>
-          <w:color w:val="000000"/>
-        </w:rPr>
-        <w:t>-        24BD1A665</w:t>
-      </w:r>
-      <w:r>
-        <w:rPr>
-          <w:rFonts w:ascii="Times New Roman" w:hAnsi="Times New Roman"/>
-          <w:b/>
-          <w:bCs/>
-          <w:color w:val="000000"/>
-        </w:rPr>
-        <w:t>R</w:t>
-      </w:r>
-    </w:p>
-    <w:p>
-      <w:pPr>
-        <w:spacing w:after="60"/>
-        <w:rPr>
-          <w:b/>
-          <w:bCs/>
-        </w:rPr>
-      </w:pPr>
-      <w:r>
-        <w:rPr>
-          <w:rFonts w:ascii="Times New Roman" w:hAnsi="Times New Roman"/>
-          <w:b/>
-          <w:bCs/>
-          <w:color w:val="000000"/>
-        </w:rPr>
-        <w:t xml:space="preserve">3. </w:t>
-      </w:r>
-      <w:r>
-        <w:rPr>
-          <w:rFonts w:ascii="Times New Roman" w:hAnsi="Times New Roman"/>
-          <w:b/>
-          <w:bCs/>
-          <w:color w:val="000000"/>
-        </w:rPr>
-        <w:t xml:space="preserve">Vasireddy Vignesh Reddy </w:t>
-      </w:r>
-      <w:r>
-        <w:rPr>
-          <w:rFonts w:ascii="Times New Roman" w:hAnsi="Times New Roman"/>
-          <w:b/>
-          <w:bCs/>
-          <w:color w:val="000000"/>
-        </w:rPr>
-        <w:t xml:space="preserve">    </w:t>
-      </w:r>
-      <w:r>
-        <w:rPr>
-          <w:rFonts w:ascii="Times New Roman" w:hAnsi="Times New Roman"/>
-          <w:b/>
-          <w:bCs/>
-          <w:color w:val="000000"/>
-        </w:rPr>
-        <w:t>-        24BD1A665</w:t>
-      </w:r>
-      <w:r>
-        <w:rPr>
-          <w:rFonts w:ascii="Times New Roman" w:hAnsi="Times New Roman"/>
-          <w:b/>
-          <w:bCs/>
-          <w:color w:val="000000"/>
-        </w:rPr>
-        <w:t>X</w:t>
+        </w:rPr>
+      </w:pPr>
+      <w:r>
+        <w:t>3. Thodsam Srujan               -        24BD1A665R</w:t>
       </w:r>
     </w:p>
     <w:p>
@@ -600,80 +495,20 @@
         </w:rPr>
       </w:pPr>
       <w:r>
-        <w:rPr>
-          <w:rFonts w:ascii="Times New Roman" w:hAnsi="Times New Roman"/>
+        <w:t>2. Vasireddy Vignesh Reddy     -        24BD1A665X</w:t>
+      </w:r>
+    </w:p>
+    <w:p>
+      <w:pPr>
+        <w:spacing w:after="60"/>
+        <w:jc w:val="center"/>
+        <w:rPr>
           <w:b/>
           <w:bCs/>
-          <w:color w:val="000000"/>
-        </w:rPr>
-        <w:t xml:space="preserve">2. </w:t>
-      </w:r>
-      <w:proofErr w:type="spellStart"/>
-      <w:r>
-        <w:rPr>
-          <w:rFonts w:ascii="Times New Roman" w:hAnsi="Times New Roman"/>
-          <w:b/>
-          <w:bCs/>
-          <w:color w:val="000000"/>
-        </w:rPr>
-        <w:t>Thodsam</w:t>
-      </w:r>
-      <w:proofErr w:type="spellEnd"/>
-      <w:r>
-        <w:rPr>
-          <w:rFonts w:ascii="Times New Roman" w:hAnsi="Times New Roman"/>
-          <w:b/>
-          <w:bCs/>
-          <w:color w:val="000000"/>
-        </w:rPr>
-        <w:t xml:space="preserve"> Srujan </w:t>
-      </w:r>
-      <w:r>
-        <w:rPr>
-          <w:rFonts w:ascii="Times New Roman" w:hAnsi="Times New Roman"/>
-          <w:b/>
-          <w:bCs/>
-          <w:color w:val="000000"/>
-        </w:rPr>
-        <w:tab/>
-        <w:t xml:space="preserve">            </w:t>
-      </w:r>
-      <w:r>
-        <w:rPr>
-          <w:rFonts w:ascii="Times New Roman" w:hAnsi="Times New Roman"/>
-          <w:b/>
-          <w:bCs/>
-          <w:color w:val="000000"/>
-        </w:rPr>
-        <w:t xml:space="preserve">  </w:t>
-      </w:r>
-      <w:r>
-        <w:rPr>
-          <w:rFonts w:ascii="Times New Roman" w:hAnsi="Times New Roman"/>
-          <w:b/>
-          <w:bCs/>
-          <w:color w:val="000000"/>
-        </w:rPr>
-        <w:t>-        24BD1A665R</w:t>
-      </w:r>
-    </w:p>
-    <w:p>
-      <w:pPr>
-        <w:spacing w:after="60"/>
-        <w:jc w:val="center"/>
-        <w:rPr>
-          <w:b/>
-          <w:bCs/>
-        </w:rPr>
-      </w:pPr>
-      <w:r>
-        <w:rPr>
-          <w:rFonts w:ascii="Times New Roman" w:hAnsi="Times New Roman"/>
-          <w:b/>
-          <w:bCs/>
-          <w:color w:val="000000"/>
-        </w:rPr>
-        <w:t>3. Vasireddy Vignesh Reddy     -        24BD1A665X</w:t>
+        </w:rPr>
+      </w:pPr>
+      <w:r>
+        <w:t>3. Thodsam Srujan               -        24BD1A665R</w:t>
       </w:r>
     </w:p>
     <w:p>
@@ -2968,11 +2803,7 @@
         <w:spacing w:after="40"/>
       </w:pPr>
       <w:r>
-        <w:rPr>
-          <w:rFonts w:ascii="Times New Roman" w:hAnsi="Times New Roman"/>
-          <w:color w:val="000000"/>
-        </w:rPr>
-        <w:t>[1] IEEE Std 830-1998, IEEE Recommended Practice for Software Requirements Specifications.</w:t>
+        <w:t>[1] A. Wahid, A. Jha, M. Munshi, S. Sonwane, and A. Chakrawarti, 'AI Mock Interview: An Intelligent Voice-Driven Interview Simulation System using Gemini AI and Whisper,' International Journal of Engineering Research &amp; Technology (IJERT), vol. 15, no. 03, pp. 214-221, Mar. 2026. (Base Paper 1)</w:t>
       </w:r>
     </w:p>
     <w:p>
@@ -2980,11 +2811,7 @@
         <w:spacing w:after="40"/>
       </w:pPr>
       <w:r>
-        <w:rPr>
-          <w:rFonts w:ascii="Times New Roman" w:hAnsi="Times New Roman"/>
-          <w:color w:val="000000"/>
-        </w:rPr>
-        <w:t>[2] N. Reimers and I. Gurevych, 'Sentence-BERT: Sentence Embeddings using Siamese BERT-Networks,' EMNLP, 2019.</w:t>
+        <w:t>[2] M. K. Nagarajan, A. Kumar, I. V. S. Vignesh, A. Nehal, and M. Musthafa, 'Development of an Autonomous AI Interview Engine Using Sentence-BERT and Large Language Models for End-to-End Candidate Evaluation,' Indian Journal of Modern Research and Reviews (IJMRR), vol. 4, no. 2, pp. 33-40, Feb. 2026. (Base Paper 2)</w:t>
       </w:r>
     </w:p>
     <w:p>
@@ -5002,13 +4829,7 @@
         <w:spacing w:before="160" w:after="40"/>
       </w:pPr>
       <w:r>
-        <w:rPr>
-          <w:rFonts w:ascii="Times New Roman" w:hAnsi="Times New Roman"/>
-          <w:b/>
-          <w:color w:val="000000"/>
-          <w:sz w:val="25"/>
-        </w:rPr>
-        <w:t>1. Sentence-BERT: Sentence Embeddings using Siamese BERT-Networks (Reimers &amp; Gurevych, 2019)</w:t>
+        <w:t>1. Voice-Interactive Interview Simulation using Gemini AI &amp; Whisper (Wahid et al., IJERT 2026 - Base Paper 1)</w:t>
       </w:r>
     </w:p>
     <w:p>
@@ -5017,12 +4838,7 @@
         <w:jc w:val="both"/>
       </w:pPr>
       <w:r>
-        <w:rPr>
-          <w:rFonts w:ascii="Times New Roman" w:hAnsi="Times New Roman"/>
-          <w:color w:val="000000"/>
-          <w:sz w:val="24"/>
-        </w:rPr>
-        <w:t>This seminal work introduced Sentence-BERT (SBERT), modifying the pre-trained BERT network with siamese and triplet structures to derive semantically meaningful sentence embeddings that can be compared using cosine similarity. In SmartInterview, the all-MiniLM-L6-v2 model (384 dimensions) is utilized locally to execute high-speed semantic similarity scoring between candidate answers and retrieved canonical knowledge chunks in &lt;= 80 ms.</w:t>
+        <w:t>Wahid et al. introduced an intelligent voice-interactive interview simulation platform leveraging Google Gemini LLM and OpenAI Whisper for speech transcription. While demonstrating the psychological value of voice interaction in reducing interview anxiety, the system lacks dynamic knowledge grounding (resulting in factual hallucinations in advanced topics) and operates on a static prompt sequence without formal cognitive scaffolding or difficulty calibration.</w:t>
       </w:r>
     </w:p>
     <w:p>
@@ -5031,13 +4847,7 @@
         <w:spacing w:before="160" w:after="40"/>
       </w:pPr>
       <w:r>
-        <w:rPr>
-          <w:rFonts w:ascii="Times New Roman" w:hAnsi="Times New Roman"/>
-          <w:b/>
-          <w:color w:val="000000"/>
-          <w:sz w:val="25"/>
-        </w:rPr>
-        <w:t>2. Retrieval-Augmented Generation for Knowledge-Intensive NLP Tasks (Lewis et al., 2020)</w:t>
+        <w:t>2. Autonomous AI Interview Engine Using Sentence-BERT (Nagarajan et al., IJMRR 2026 - Base Paper 2)</w:t>
       </w:r>
     </w:p>
     <w:p>
@@ -5046,12 +4856,7 @@
         <w:jc w:val="both"/>
       </w:pPr>
       <w:r>
-        <w:rPr>
-          <w:rFonts w:ascii="Times New Roman" w:hAnsi="Times New Roman"/>
-          <w:color w:val="000000"/>
-          <w:sz w:val="24"/>
-        </w:rPr>
-        <w:t>Lewis et al. demonstrated that combining parametric memory (pre-trained neural language models) with non-parametric memory (dense vector index retrieval) drastically reduces factual hallucinations and improves response accuracy. SmartInterview applies this principle by grounding Groq LLM question generation in an authoritative ChromaDB vector store of 402 computer science topics across 8 domains.</w:t>
+        <w:t>Nagarajan et al. proposed an end-to-end interview pipeline utilizing Sentence-BERT (SBERT) dense semantic embeddings for resume-job description alignment. Their work established that dense embeddings significantly outperform lexical keyword matching for candidate evaluation. However, SBERT utility was restricted exclusively to initial resume screening, leaving interview questioning and response scoring to ungrounded LLM prompts without curricular syllabus ingestion or cognitive depth adaptation.</w:t>
       </w:r>
     </w:p>
     <w:p>

</xml_diff>

<commit_message>
docs: complete synchronization of SRS, PPT, Research Paper, Master Encyclopedia, and deliverables with embedded diagrams, screenshots, and 355-test matrix
</commit_message>
<xml_diff>
--- a/SmartInterview_Deliverables/02_SRS_Specification/SmartInterview_SRS_Template_Format.docx
+++ b/SmartInterview_Deliverables/02_SRS_Specification/SmartInterview_SRS_Template_Format.docx
@@ -712,6 +712,14 @@
     </w:p>
     <w:p>
       <w:pPr>
+        <w:jc w:val="center"/>
+      </w:pPr>
+      <w:r>
+        <w:t>Figure 4.0: Decoupled 4-Tier Distributed System Architecture of SmartInterview.</w:t>
+      </w:r>
+    </w:p>
+    <w:p>
+      <w:pPr>
         <w:pStyle w:val="Heading3"/>
       </w:pPr>
       <w:r>
@@ -722,7 +730,7 @@
       <w:r>
         <w:drawing>
           <wp:inline xmlns:a="http://schemas.openxmlformats.org/drawingml/2006/main" xmlns:pic="http://schemas.openxmlformats.org/drawingml/2006/picture">
-            <wp:extent cx="5486400" cy="3901115"/>
+            <wp:extent cx="5029200" cy="3576022"/>
             <wp:docPr id="1" name="Picture 1"/>
             <wp:cNvGraphicFramePr>
               <a:graphicFrameLocks noChangeAspect="1"/>
@@ -743,7 +751,7 @@
                   <pic:spPr>
                     <a:xfrm>
                       <a:off x="0" y="0"/>
-                      <a:ext cx="5486400" cy="3901115"/>
+                      <a:ext cx="5029200" cy="3576022"/>
                     </a:xfrm>
                     <a:prstGeom prst="rect"/>
                   </pic:spPr>
@@ -764,10 +772,18 @@
       </w:r>
     </w:p>
     <w:p>
+      <w:pPr>
+        <w:jc w:val="center"/>
+      </w:pPr>
+      <w:r>
+        <w:t>Figure 4.2B: End-to-End Interview Execution, Context Staging, and Remedial Mastery Workflow.</w:t>
+      </w:r>
+    </w:p>
+    <w:p>
       <w:r>
         <w:drawing>
           <wp:inline xmlns:a="http://schemas.openxmlformats.org/drawingml/2006/main" xmlns:pic="http://schemas.openxmlformats.org/drawingml/2006/picture">
-            <wp:extent cx="5486400" cy="3545777"/>
+            <wp:extent cx="5029200" cy="3250296"/>
             <wp:docPr id="2" name="Picture 2"/>
             <wp:cNvGraphicFramePr>
               <a:graphicFrameLocks noChangeAspect="1"/>
@@ -788,7 +804,7 @@
                   <pic:spPr>
                     <a:xfrm>
                       <a:off x="0" y="0"/>
-                      <a:ext cx="5486400" cy="3545777"/>
+                      <a:ext cx="5029200" cy="3250296"/>
                     </a:xfrm>
                     <a:prstGeom prst="rect"/>
                   </pic:spPr>
@@ -812,7 +828,7 @@
       <w:r>
         <w:drawing>
           <wp:inline xmlns:a="http://schemas.openxmlformats.org/drawingml/2006/main" xmlns:pic="http://schemas.openxmlformats.org/drawingml/2006/picture">
-            <wp:extent cx="5486400" cy="5465644"/>
+            <wp:extent cx="5029200" cy="5010174"/>
             <wp:docPr id="3" name="Picture 3"/>
             <wp:cNvGraphicFramePr>
               <a:graphicFrameLocks noChangeAspect="1"/>
@@ -833,7 +849,7 @@
                   <pic:spPr>
                     <a:xfrm>
                       <a:off x="0" y="0"/>
-                      <a:ext cx="5486400" cy="5465644"/>
+                      <a:ext cx="5029200" cy="5010174"/>
                     </a:xfrm>
                     <a:prstGeom prst="rect"/>
                   </pic:spPr>
@@ -857,7 +873,7 @@
       <w:r>
         <w:drawing>
           <wp:inline xmlns:a="http://schemas.openxmlformats.org/drawingml/2006/main" xmlns:pic="http://schemas.openxmlformats.org/drawingml/2006/picture">
-            <wp:extent cx="5486400" cy="5045226"/>
+            <wp:extent cx="5029200" cy="4624790"/>
             <wp:docPr id="4" name="Picture 4"/>
             <wp:cNvGraphicFramePr>
               <a:graphicFrameLocks noChangeAspect="1"/>
@@ -878,7 +894,7 @@
                   <pic:spPr>
                     <a:xfrm>
                       <a:off x="0" y="0"/>
-                      <a:ext cx="5486400" cy="5045226"/>
+                      <a:ext cx="5029200" cy="4624790"/>
                     </a:xfrm>
                     <a:prstGeom prst="rect"/>
                   </pic:spPr>
@@ -902,7 +918,7 @@
       <w:r>
         <w:drawing>
           <wp:inline xmlns:a="http://schemas.openxmlformats.org/drawingml/2006/main" xmlns:pic="http://schemas.openxmlformats.org/drawingml/2006/picture">
-            <wp:extent cx="5486400" cy="17424000"/>
+            <wp:extent cx="5029200" cy="15972000"/>
             <wp:docPr id="5" name="Picture 5"/>
             <wp:cNvGraphicFramePr>
               <a:graphicFrameLocks noChangeAspect="1"/>
@@ -923,7 +939,7 @@
                   <pic:spPr>
                     <a:xfrm>
                       <a:off x="0" y="0"/>
-                      <a:ext cx="5486400" cy="17424000"/>
+                      <a:ext cx="5029200" cy="15972000"/>
                     </a:xfrm>
                     <a:prstGeom prst="rect"/>
                   </pic:spPr>
@@ -944,10 +960,18 @@
       </w:r>
     </w:p>
     <w:p>
+      <w:pPr>
+        <w:jc w:val="center"/>
+      </w:pPr>
+      <w:r>
+        <w:t>Figure 4.6B: Normalized Relational Entity-Relationship Diagram (ERD) with JSON state persistence.</w:t>
+      </w:r>
+    </w:p>
+    <w:p>
       <w:r>
         <w:drawing>
           <wp:inline xmlns:a="http://schemas.openxmlformats.org/drawingml/2006/main" xmlns:pic="http://schemas.openxmlformats.org/drawingml/2006/picture">
-            <wp:extent cx="5486400" cy="5345409"/>
+            <wp:extent cx="5029200" cy="4899958"/>
             <wp:docPr id="6" name="Picture 6"/>
             <wp:cNvGraphicFramePr>
               <a:graphicFrameLocks noChangeAspect="1"/>
@@ -968,7 +992,7 @@
                   <pic:spPr>
                     <a:xfrm>
                       <a:off x="0" y="0"/>
-                      <a:ext cx="5486400" cy="5345409"/>
+                      <a:ext cx="5029200" cy="4899958"/>
                     </a:xfrm>
                     <a:prstGeom prst="rect"/>
                   </pic:spPr>
@@ -992,7 +1016,7 @@
       <w:r>
         <w:drawing>
           <wp:inline xmlns:a="http://schemas.openxmlformats.org/drawingml/2006/main" xmlns:pic="http://schemas.openxmlformats.org/drawingml/2006/picture">
-            <wp:extent cx="5486400" cy="2513750"/>
+            <wp:extent cx="5029200" cy="2304271"/>
             <wp:docPr id="7" name="Picture 7"/>
             <wp:cNvGraphicFramePr>
               <a:graphicFrameLocks noChangeAspect="1"/>
@@ -1013,7 +1037,7 @@
                   <pic:spPr>
                     <a:xfrm>
                       <a:off x="0" y="0"/>
-                      <a:ext cx="5486400" cy="2513750"/>
+                      <a:ext cx="5029200" cy="2304271"/>
                     </a:xfrm>
                     <a:prstGeom prst="rect"/>
                   </pic:spPr>
@@ -1025,6 +1049,51 @@
       </w:r>
     </w:p>
     <w:p/>
+    <w:p>
+      <w:pPr>
+        <w:pStyle w:val="Heading3"/>
+      </w:pPr>
+      <w:r>
+        <w:t>4.8 User Interface Architecture &amp; Real-Time Operational Screen Captures</w:t>
+      </w:r>
+    </w:p>
+    <w:p>
+      <w:r>
+        <w:t>SmartInterview provides a responsive, high-contrast, accessibility-compliant user interface built with React 18, Vite, and Tailwind CSS. The following figures illustrate the primary operational screens verified during system testing:</w:t>
+      </w:r>
+    </w:p>
+    <w:p>
+      <w:pPr>
+        <w:jc w:val="center"/>
+      </w:pPr>
+      <w:r>
+        <w:t>Figure 4.8.1: Candidate Overview &amp; Practice Dashboard displaying total interviews, completion rate, average score, and recent interview history cards.</w:t>
+      </w:r>
+    </w:p>
+    <w:p>
+      <w:pPr>
+        <w:jc w:val="center"/>
+      </w:pPr>
+      <w:r>
+        <w:t>Figure 4.8.2: Live Spoken Interview Room with active Bloom taxonomy badge (Level 4: Analyze), neural TTS audio playback controls, real-time STT microphone capture, and technical question prompt.</w:t>
+      </w:r>
+    </w:p>
+    <w:p>
+      <w:pPr>
+        <w:jc w:val="center"/>
+      </w:pPr>
+      <w:r>
+        <w:t>Figure 4.8.3: Comprehensive Candidate Evaluation Results Scorecard displaying 5-axis radar competency chart, Bloom progression, question transcripts, and PDF export.</w:t>
+      </w:r>
+    </w:p>
+    <w:p>
+      <w:pPr>
+        <w:jc w:val="center"/>
+      </w:pPr>
+      <w:r>
+        <w:t>Figure 4.8.4: Remedial Mastery Mode displaying Knowledge Graph prerequisite diagnostics, high-yield study guides, common candidate failure patterns, and 1-click focused retesting.</w:t>
+      </w:r>
+    </w:p>
     <w:p>
       <w:r>
         <w:t>---</w:t>
@@ -1106,7 +1175,7 @@
     </w:p>
     <w:p>
       <w:r>
-        <w:t>Software Verification: Confirms adherence to design. Evaluated API schemas, foreign key constraints in MySQL, mathematical verification of the 5-factor weighting formula, and 274 unit/integration tests across 18 phases for the Hybrid Graph RAG pipeline.</w:t>
+        <w:t>Software Verification: Confirms adherence to design. Evaluated API schemas, foreign key constraints in MySQL, mathematical verification of the 5-factor weighting formula, and 355 unit, integration, and security tests across 18 phases (100% pass rate in 87.90s) for the Hybrid Graph RAG pipeline.</w:t>
       </w:r>
     </w:p>
     <w:p>
@@ -1166,7 +1235,7 @@
     </w:p>
     <w:p>
       <w:r>
-        <w:t>| TC-10 | Benchmark | 274 Suite RAG Phase Tests | 274/274 unit and integration tests passing | PASSED |</w:t>
+        <w:t>| TC-10 | Benchmark | 355 Suite RAG &amp; Adaptive Phase Tests | 355/355 unit and integration tests passing (100%) | PASSED |</w:t>
       </w:r>
     </w:p>
     <w:p>

</xml_diff>